<commit_message>
docs: keep LangGraph as the only first-version orchestrator
Update the revised proposal outline and README to state LangGraph-only
orchestration, and record collaboration dispatch rules in AGENTS.md.
</commit_message>
<xml_diff>
--- a/submission/proposal/多智能体协同财务欺诈识别方案总结大纲_修订版.docx
+++ b/submission/proposal/多智能体协同财务欺诈识别方案总结大纲_修订版.docx
@@ -125,7 +125,7 @@
         <w:pStyle w:val="ProposalBullet"/>
       </w:pPr>
       <w:r>
-        <w:t>•  服务与编排层：FastAPI 接收任务；Manager Agent 通过 LangGraph 调用工具并控制状态、调用预算和补检次数。</w:t>
+        <w:t>•  服务与编排层：FastAPI 接收任务。LangGraph 是第一版唯一的智能体编排框架，由 Manager Agent 用它安排检索、工具调用、汇总、补检与停止条件，并控制状态、调用预算和补检次数。</w:t>
       </w:r>
     </w:p>
     <w:p>
@@ -177,7 +177,7 @@
     <w:p>
       <w:pPr/>
       <w:r>
-        <w:t>第一版使用 LangGraph 作为唯一编排框架，采用明确流程和条件分支管理补充检索、核验退回及停止条件。其官方文档介绍了预定义工作流与动态智能体流程，可作为编排设计参考。</w:t>
+        <w:t>第一版只采用 LangGraph 作为唯一智能体编排框架，用明确流程和条件分支安排检索、工具调用、汇总、补检与停止条件。React + TypeScript + Vite、FastAPI、云端模型 API 和本地 Python 计算仍按原职责保留，它们不是新增的智能体编排框架。其官方文档介绍了预定义工作流与动态智能体流程，可作为编排设计参考。</w:t>
       </w:r>
       <w:hyperlink r:id="rId8">
         <w:r>
@@ -235,7 +235,7 @@
         <w:pStyle w:val="ProposalBullet"/>
       </w:pPr>
       <w:r>
-        <w:t>•  范围收缩：不叠加 CrewAI、Foundry Toolkit、AgentScope 或 Dify；不建设云端业务平台、分布式集群或本地模型服务。</w:t>
+        <w:t>•  范围收缩：第一版只采用 LangGraph 组织分析流程，不额外引入智能体编排框架或可视化搭建平台；不建设云端业务平台、分布式集群或本地模型服务。</w:t>
       </w:r>
     </w:p>
     <w:p>

</xml_diff>